<commit_message>
Fix HTTP 431 sur validation Pré-Clôture Bancaire (payload -> Supabase)
Le lien "Confirmer (niveau 1)" encodait tout le payload en base64 dans
la query string (21 689 caractères), dépassant la limite d'en-têtes
de Node.js. Ajout de la table pre_cloture_bancaire_pending_validations
pour stocker le payload côté serveur ; le workflow n8n ne transmet
désormais qu'un id court dans l'URL. Guide utilisateur mis à jour en
conséquence (note de fiabilité renforcée).

Co-Authored-By: Claude Sonnet 5 <noreply@anthropic.com>
</commit_message>
<xml_diff>
--- a/docs/transferai-admin/159_Guide_Utilisateur_Cas_Usage_Pre_Cloture_Bancaire_Webinaire.docx
+++ b/docs/transferai-admin/159_Guide_Utilisateur_Cas_Usage_Pre_Cloture_Bancaire_Webinaire.docx
@@ -856,6 +856,23 @@
         </w:tc>
       </w:tr>
     </w:tbl>
+    <w:p>
+      <w:pPr>
+        <w:spacing w:after="160" w:line="300"/>
+      </w:pPr>
+      <w:r>
+        <w:rPr>
+          <w:b w:val="false"/>
+          <w:bCs w:val="false"/>
+          <w:i/>
+          <w:iCs/>
+          <w:color w:val="1F2937"/>
+          <w:sz w:val="21"/>
+          <w:szCs w:val="21"/>
+        </w:rPr>
+        <w:t xml:space="preserve">Fiabilité renforcée (18/07/2026) : le lien de validation envoyé par email repose désormais sur une référence sécurisée plutôt que sur les données elles-mêmes, ce qui garantit son bon fonctionnement quel que soit le volume d’anomalies détectées lors d’un cycle de pré-clôture.</w:t>
+      </w:r>
+    </w:p>
     <w:p>
       <w:pPr>
         <w:pStyle w:val="Heading1"/>

</xml_diff>